<commit_message>
Note S3's object-level access model in the S3 cheat sheet
Co-Authored-By: Claude Sonnet 5 <noreply@anthropic.com>
Claude-Session: https://claude.ai/code/session_01Xkm4Ets8ARY2SvaGfF9a7K
</commit_message>
<xml_diff>
--- a/cde/cde-stage3/S3-Deep-Dive-Cheat-Sheet.docx
+++ b/cde/cde-stage3/S3-Deep-Dive-Cheat-Sheet.docx
@@ -2009,6 +2009,23 @@
           <w:szCs w:val="24"/>
         </w:rPr>
         <w:t xml:space="preserve">Store it in S3; announce it with SNS/SQS/Kinesis; query it with an engine; keep row-level truth in a database.</w:t>
+      </w:r>
+    </w:p>
+    <w:p>
+      <w:pPr>
+        <w:keepLines/>
+        <w:spacing w:after="160" w:before="40"/>
+      </w:pPr>
+      <w:r>
+        <w:rPr>
+          <w:rFonts w:ascii="Aptos" w:cs="Aptos" w:eastAsia="Aptos" w:hAnsi="Aptos"/>
+          <w:i/>
+          <w:iCs/>
+          <w:color w:val="404040"/>
+          <w:sz w:val="24"/>
+          <w:szCs w:val="24"/>
+        </w:rPr>
+        <w:t xml:space="preserve">Both lists come back to one fact: S3 works at the object level - every read and write addresses exactly one key, with no built-in call that fetches or updates several objects at once. That is what makes it ideal for landing arbitrary files fast, and why retrieving or updating many small objects one by one adds up in overhead.</w:t>
       </w:r>
     </w:p>
     <w:p>

</xml_diff>